<commit_message>
static HTML for Terms of Use and Privacy Policy
</commit_message>
<xml_diff>
--- a/LottoIQ_HowTo_Manual.docx
+++ b/LottoIQ_HowTo_Manual.docx
@@ -4945,7 +4945,7 @@
         <w:rPr>
           <w:rFonts w:ascii="Arial" w:cs="Arial" w:eastAsia="Arial" w:hAnsi="Arial"/>
         </w:rPr>
-        <w:t xml:space="preserve">Supabase handles authentication: email/password sign-up with mandatory email confirmation, login, logout, and password reset. Stripe Checkout, called through two Netlify Functions, handles subscription billing. The auth gate is implemented in auth.js, which runs before all other JS files on every game page. Memberstack has been fully retired — both replaced in code and the account itself cancelled (see 9.1 for the migration record).</w:t>
+        <w:t xml:space="preserve">Supabase handles authentication: email/password sign-up with mandatory email confirmation, login, logout, and password reset. As of August 2026, an account is only required for Insider — Standard-tier content on every game page is public with no session (see 4.16). Stripe Checkout, called through two Netlify Functions, handles subscription billing. The auth gate is implemented in auth.js, which runs before all other JS files on every game page. Memberstack has been fully retired — both replaced in code and the account itself cancelled (see 9.1 for the migration record).</w:t>
       </w:r>
     </w:p>
     <w:p>
@@ -5073,7 +5073,7 @@
         <w:rPr>
           <w:rFonts w:ascii="Arial" w:cs="Arial" w:eastAsia="Arial" w:hAnsi="Arial"/>
         </w:rPr>
-        <w:t xml:space="preserve">If not logged in: redirect immediately to /signin?return=[current page URL].</w:t>
+        <w:t xml:space="preserve">If not logged in: treat the visitor as an anonymous Standard-tier member (no redirect). Standard-tier content is free and public — see 4.16.</w:t>
       </w:r>
     </w:p>
     <w:p>
@@ -5569,7 +5569,69 @@
                 <w:sz w:val="20"/>
                 <w:szCs w:val="20"/>
               </w:rPr>
-              <w:t xml:space="preserve">Shows member’s first initial | Same</w:t>
+              <w:t xml:space="preserve">Hidden for anonymous visitors (see .nav-signin below); shows first initial for a real Standard session | Same</w:t>
+            </w:r>
+          </w:p>
+        </w:tc>
+      </w:tr>
+      <w:tr>
+        <w:tc>
+          <w:tcPr>
+            <w:tcW w:type="dxa" w:w="3000"/>
+            <w:tcBorders>
+              <w:top w:val="single" w:color="CCCCCC" w:sz="1"/>
+              <w:left w:val="single" w:color="CCCCCC" w:sz="1"/>
+              <w:bottom w:val="single" w:color="CCCCCC" w:sz="1"/>
+              <w:right w:val="single" w:color="CCCCCC" w:sz="1"/>
+            </w:tcBorders>
+            <w:shd w:fill="F2F2F2" w:val="clear"/>
+            <w:tcMar>
+              <w:top w:type="dxa" w:w="100"/>
+              <w:left w:type="dxa" w:w="150"/>
+              <w:bottom w:type="dxa" w:w="100"/>
+              <w:right w:type="dxa" w:w="150"/>
+            </w:tcMar>
+          </w:tcPr>
+          <w:p>
+            <w:r>
+              <w:rPr>
+                <w:rFonts w:ascii="Arial" w:cs="Arial" w:eastAsia="Arial" w:hAnsi="Arial"/>
+                <w:b/>
+                <w:bCs/>
+                <w:color w:val="0A0E1A"/>
+                <w:sz w:val="20"/>
+                <w:szCs w:val="20"/>
+              </w:rPr>
+              <w:t xml:space="preserve">.nav-signin (added Aug 2026)</w:t>
+            </w:r>
+          </w:p>
+        </w:tc>
+        <w:tc>
+          <w:tcPr>
+            <w:tcW w:type="dxa" w:w="6360"/>
+            <w:tcBorders>
+              <w:top w:val="single" w:color="CCCCCC" w:sz="1"/>
+              <w:left w:val="single" w:color="CCCCCC" w:sz="1"/>
+              <w:bottom w:val="single" w:color="CCCCCC" w:sz="1"/>
+              <w:right w:val="single" w:color="CCCCCC" w:sz="1"/>
+            </w:tcBorders>
+            <w:shd w:fill="FFFFFF" w:val="clear"/>
+            <w:tcMar>
+              <w:top w:type="dxa" w:w="100"/>
+              <w:left w:type="dxa" w:w="150"/>
+              <w:bottom w:type="dxa" w:w="100"/>
+              <w:right w:type="dxa" w:w="150"/>
+            </w:tcMar>
+          </w:tcPr>
+          <w:p>
+            <w:r>
+              <w:rPr>
+                <w:rFonts w:ascii="Arial" w:cs="Arial" w:eastAsia="Arial" w:hAnsi="Arial"/>
+                <w:color w:val="333333"/>
+                <w:sz w:val="20"/>
+                <w:szCs w:val="20"/>
+              </w:rPr>
+              <w:t xml:space="preserve">Shown (incl. anonymous) | Hidden</w:t>
             </w:r>
           </w:p>
         </w:tc>
@@ -5665,7 +5727,7 @@
         <w:rPr>
           <w:rFonts w:ascii="Arial" w:cs="Arial" w:eastAsia="Arial" w:hAnsi="Arial"/>
         </w:rPr>
-        <w:t xml:space="preserve">When a non-member tries to visit a game page, auth.js redirects them to /signin and appends a ?return= query parameter with the original URL. After successful login, auth.js reads this parameter and redirects the member back to the page they originally tried to visit.</w:t>
+        <w:t xml:space="preserve">As of August 2026, game pages no longer force a redirect for anonymous visitors (see 4.16). The ?return= parameter is still used, but now only fires when a visitor deliberately clicks Sign In or an Upgrade button that requires an account — auth.js appends ?return=[current page URL] to the /signin link at that point, and reads it back after successful login to send the member back to the page they were on. The one page that still redirects unauthenticated/non-Insider visitors on load is /games/custom/, which requires Insider tier specifically — see 4.16.</w:t>
       </w:r>
     </w:p>
     <w:p>
@@ -6670,7 +6732,7 @@
         <w:rPr>
           <w:rFonts w:ascii="Arial" w:cs="Arial" w:eastAsia="Arial" w:hAnsi="Arial"/>
         </w:rPr>
-        <w:t xml:space="preserve">Attempt to visit a game page without logging in — you should be redirected to /signin.</w:t>
+        <w:t xml:space="preserve">Open a game page in an incognito window (no session) — you should see the full Standard-tier page (heatmap, generator, checker) with Insider-only features locked and a .nav-signin link in the nav, not a redirect. Then attempt to visit /games/custom/ the same way — that page should still show the "Insider Only — Upgrade" screen (see 4.16).</w:t>
       </w:r>
     </w:p>
     <w:p>
@@ -7415,7 +7477,7 @@
         <w:rPr>
           <w:rFonts w:ascii="Arial" w:cs="Arial" w:eastAsia="Arial" w:hAnsi="Arial"/>
         </w:rPr>
-        <w:t xml:space="preserve">Members can sign up (with mandatory email confirmation), log in, log out, and reset a forgotten password. Standard members see locked features; Insider members see the full toolset. Upgrades complete through Stripe Checkout and tier changes are reflected within a few seconds of the webhook firing, without a page reload.</w:t>
+        <w:t xml:space="preserve">Anonymous visitors can use all Standard-tier features on any game page with no account. Members who do sign up can log in, log out, and reset a forgotten password. Both anonymous visitors and logged-in Standard members see Insider features locked; Insider members see the full toolset, including /games/custom/. Upgrades complete through Stripe Checkout and tier changes are reflected within a few seconds of the webhook firing, without a page reload.</w:t>
       </w:r>
     </w:p>
     <w:p>
@@ -10924,6 +10986,123 @@
     </w:p>
     <w:p>
       <w:pPr>
+        <w:pStyle w:val="Heading2"/>
+        <w:pBdr>
+          <w:bottom w:val="single" w:color="D4AF37" w:sz="3"/>
+        </w:pBdr>
+        <w:spacing w:after="120" w:before="300"/>
+      </w:pPr>
+      <w:r>
+        <w:rPr>
+          <w:rFonts w:ascii="Arial" w:cs="Arial" w:eastAsia="Arial" w:hAnsi="Arial"/>
+          <w:b/>
+          <w:bCs/>
+          <w:color w:val="0A0E1A"/>
+          <w:sz w:val="26"/>
+          <w:szCs w:val="26"/>
+        </w:rPr>
+        <w:t xml:space="preserve">4.16  Standard Tier Made Public — No Sign-Up Required (August 2026)</w:t>
+      </w:r>
+    </w:p>
+    <w:p>
+      <w:pPr>
+        <w:spacing w:after="120" w:before="0"/>
+      </w:pPr>
+      <w:r>
+        <w:rPr>
+          <w:rFonts w:ascii="Arial" w:cs="Arial" w:eastAsia="Arial" w:hAnsi="Arial"/>
+        </w:rPr>
+        <w:t xml:space="preserve">The auth gate was reworked so Standard-tier content (dashboard, heatmap, hot/cold/overdue, pattern stats, single-set generator, checker) is fully public — no Supabase session required. Only Insider features and the /games/custom/ page still require an account. This replaced the previous behaviour where auth.js redirected every anonymous visitor to /signin before any page content rendered.</w:t>
+      </w:r>
+    </w:p>
+    <w:p>
+      <w:pPr>
+        <w:spacing w:after="120" w:before="0"/>
+      </w:pPr>
+      <w:r>
+        <w:rPr>
+          <w:rFonts w:ascii="Arial" w:cs="Arial" w:eastAsia="Arial" w:hAnsi="Arial"/>
+        </w:rPr>
+        <w:t xml:space="preserve">Why this changed: the forced redirect meant Googlebot — which crawls with no session — was bounced to /signin (a noindex page) on every game page. Removing the static noindex tags from the game pages (see 5.5) was necessary but not sufficient to fix indexing, because Google evaluates the final rendered page, and the client-side redirect sent it to a noindex'd page regardless. Standard sign-ups had also been negligible, so gating free content behind an account was costing both SEO and conversion with no offsetting benefit.</w:t>
+      </w:r>
+    </w:p>
+    <w:p>
+      <w:pPr>
+        <w:pStyle w:val="ListParagraph"/>
+        <w:numPr>
+          <w:ilvl w:val="0"/>
+          <w:numId w:val="2"/>
+        </w:numPr>
+        <w:spacing w:after="60" w:before="0"/>
+      </w:pPr>
+      <w:r>
+        <w:rPr>
+          <w:rFonts w:ascii="Arial" w:cs="Arial" w:eastAsia="Arial" w:hAnsi="Arial"/>
+        </w:rPr>
+        <w:t xml:space="preserve">auth.js — enforceAuth() no longer calls redirectToSignin() when sb.auth.getSession() returns no session. It instead returns an anonymous stub: { id: null, email: null, tier: 'standard', firstName: null, anonymous: true }. The profile-fetch error path (a session exists but the profiles row is missing) is unchanged and still redirects — that remains a genuine account error, not the free-tier case.</w:t>
+      </w:r>
+    </w:p>
+    <w:p>
+      <w:pPr>
+        <w:pStyle w:val="ListParagraph"/>
+        <w:numPr>
+          <w:ilvl w:val="0"/>
+          <w:numId w:val="2"/>
+        </w:numPr>
+        <w:spacing w:after="60" w:before="0"/>
+      </w:pPr>
+      <w:r>
+        <w:rPr>
+          <w:rFonts w:ascii="Arial" w:cs="Arial" w:eastAsia="Arial" w:hAnsi="Arial"/>
+        </w:rPr>
+        <w:t xml:space="preserve">auth.js — applyMemberUI() now branches on memberData.anonymous. Anonymous visitors see a new .nav-signin link in place of the avatar/Manage Account/Sign out controls, which require a real session. The .nav-avatar initial computation was moved inside the non-anonymous branch to avoid a null-reference crash on memberData.email.</w:t>
+      </w:r>
+    </w:p>
+    <w:p>
+      <w:pPr>
+        <w:pStyle w:val="ListParagraph"/>
+        <w:numPr>
+          <w:ilvl w:val="0"/>
+          <w:numId w:val="2"/>
+        </w:numPr>
+        <w:spacing w:after="60" w:before="0"/>
+      </w:pPr>
+      <w:r>
+        <w:rPr>
+          <w:rFonts w:ascii="Arial" w:cs="Arial" w:eastAsia="Arial" w:hAnsi="Arial"/>
+        </w:rPr>
+        <w:t xml:space="preserve">css/nav.css — new .nav-signin style added, matching the existing .nav-manage treatment. The four game pages and proof/index.html ship with nav-avatar, nav-manage, and nav-logout hidden by default (inline style="display:none") since anonymous is now the common first-paint state; auth.js un-hides them once a real session is confirmed.</w:t>
+      </w:r>
+    </w:p>
+    <w:p>
+      <w:pPr>
+        <w:pStyle w:val="ListParagraph"/>
+        <w:numPr>
+          <w:ilvl w:val="0"/>
+          <w:numId w:val="2"/>
+        </w:numPr>
+        <w:spacing w:after="60" w:before="0"/>
+      </w:pPr>
+      <w:r>
+        <w:rPr>
+          <w:rFonts w:ascii="Arial" w:cs="Arial" w:eastAsia="Arial" w:hAnsi="Arial"/>
+        </w:rPr>
+        <w:t xml:space="preserve">games/custom/index.html — no code change was needed. It already called initAuth() and checked memberData.tier === 'insider', showing an "Insider Only — Upgrade" screen instead of the tool when false. Previously this could never fire for anonymous visitors because the old enforceAuth() redirected them to /signin first. Now it works as originally designed: anonymous and Standard visitors alike land on the upgrade prompt; only Insider gets the tool.</w:t>
+      </w:r>
+    </w:p>
+    <w:p>
+      <w:pPr>
+        <w:spacing w:after="120" w:before="0"/>
+      </w:pPr>
+      <w:r>
+        <w:rPr>
+          <w:rFonts w:ascii="Arial" w:cs="Arial" w:eastAsia="Arial" w:hAnsi="Arial"/>
+        </w:rPr>
+        <w:t xml:space="preserve">✓ Tip: /games/custom/ is the one page in the member portal that still gates on load — it checks tier === 'insider' specifically, not just session presence. Any future page that should be Insider-exclusive should follow this same pattern (render for everyone, show an upgrade prompt in place of the gated content) rather than reintroducing a hard redirect, which would recreate the indexing problem this section fixes.</w:t>
+      </w:r>
+    </w:p>
+    <w:p>
+      <w:pPr>
         <w:pStyle w:val="Heading1"/>
         <w:pBdr>
           <w:bottom w:val="single" w:color="D4AF37" w:sz="4"/>
@@ -11007,7 +11186,7 @@
         <w:rPr>
           <w:rFonts w:ascii="Arial" w:cs="Arial" w:eastAsia="Arial" w:hAnsi="Arial"/>
         </w:rPr>
-        <w:t xml:space="preserve">Homepage — hero (rewritten June 2026: headline “See Which Numbers Are Hot, Cold &amp; Overdue”, Sign Up Free CTA button, Canadian Lottery Analytics eyebrow), pricing cards (rewritten June 2026), features overview, how it works</w:t>
+        <w:t xml:space="preserve">Homepage — hero (rewritten June 2026: headline “See Which Numbers Are Hot, Cold &amp; Overdue”, Canadian Lottery Analytics eyebrow; CTA rewritten August 2026 from "Sign Up Free" to "View Live Numbers →", linking straight to stats.lottoiq.ca/games/lotto-649/ — no account needed, see 5.5), pricing cards (rewritten June 2026, updated August 2026 to mark Standard "Free — no account required"), features overview, how it works</w:t>
       </w:r>
     </w:p>
     <w:p>
@@ -11970,6 +12149,107 @@
       </w:r>
     </w:p>
     <w:p>
+      <w:pPr>
+        <w:pStyle w:val="Heading2"/>
+        <w:pBdr>
+          <w:bottom w:val="single" w:color="D4AF37" w:sz="3"/>
+        </w:pBdr>
+        <w:spacing w:after="120" w:before="300"/>
+      </w:pPr>
+      <w:r>
+        <w:rPr>
+          <w:rFonts w:ascii="Arial" w:cs="Arial" w:eastAsia="Arial" w:hAnsi="Arial"/>
+          <w:b/>
+          <w:bCs/>
+          <w:color w:val="0A0E1A"/>
+          <w:sz w:val="26"/>
+          <w:szCs w:val="26"/>
+        </w:rPr>
+        <w:t xml:space="preserve">5.5  Search Indexing — noindex Removal and Meta Descriptions (August 2026)</w:t>
+      </w:r>
+    </w:p>
+    <w:p>
+      <w:pPr>
+        <w:spacing w:after="120" w:before="0"/>
+      </w:pPr>
+      <w:r>
+        <w:rPr>
+          <w:rFonts w:ascii="Arial" w:cs="Arial" w:eastAsia="Arial" w:hAnsi="Arial"/>
+        </w:rPr>
+        <w:t xml:space="preserve">All member portal pages originally shipped with &lt;meta name="robots" content="noindex, nofollow"/&gt; per page — set individually in each page's &lt;head&gt;, not from a shared partial. This blocked Google from indexing the site entirely. The tag was removed from the five pages meant to be public and indexable, and left in place on the pages that should stay out of search results.</w:t>
+      </w:r>
+    </w:p>
+    <w:p>
+      <w:pPr>
+        <w:pStyle w:val="ListParagraph"/>
+        <w:numPr>
+          <w:ilvl w:val="0"/>
+          <w:numId w:val="2"/>
+        </w:numPr>
+        <w:spacing w:after="60" w:before="0"/>
+      </w:pPr>
+      <w:r>
+        <w:rPr>
+          <w:rFonts w:ascii="Arial" w:cs="Arial" w:eastAsia="Arial" w:hAnsi="Arial"/>
+        </w:rPr>
+        <w:t xml:space="preserve">noindex removed: games/lotto-649/, games/lotto-max/, games/lottario/, games/ontario-49/, proof/</w:t>
+      </w:r>
+    </w:p>
+    <w:p>
+      <w:pPr>
+        <w:pStyle w:val="ListParagraph"/>
+        <w:numPr>
+          <w:ilvl w:val="0"/>
+          <w:numId w:val="2"/>
+        </w:numPr>
+        <w:spacing w:after="60" w:before="0"/>
+      </w:pPr>
+      <w:r>
+        <w:rPr>
+          <w:rFonts w:ascii="Arial" w:cs="Arial" w:eastAsia="Arial" w:hAnsi="Arial"/>
+        </w:rPr>
+        <w:t xml:space="preserve">noindex kept: games/custom/ (logged-in Insider tool, not meant to rank), signin/, reset-password/</w:t>
+      </w:r>
+    </w:p>
+    <w:p>
+      <w:pPr>
+        <w:pStyle w:val="ListParagraph"/>
+        <w:numPr>
+          <w:ilvl w:val="0"/>
+          <w:numId w:val="2"/>
+        </w:numPr>
+        <w:spacing w:after="60" w:before="0"/>
+      </w:pPr>
+      <w:r>
+        <w:rPr>
+          <w:rFonts w:ascii="Arial" w:cs="Arial" w:eastAsia="Arial" w:hAnsi="Arial"/>
+        </w:rPr>
+        <w:t xml:space="preserve">Per-game meta descriptions were also fixed — lotto-max, lottario, and ontario-49 had all been shipping the Lotto 6/49 description verbatim (likely copy-pasted when those pages were built), which meant three of the four game pages had duplicate, inaccurate descriptions in search results. Each now has its own description naming that specific game.</w:t>
+      </w:r>
+    </w:p>
+    <w:p>
+      <w:pPr>
+        <w:spacing w:after="120" w:before="0"/>
+      </w:pPr>
+      <w:r>
+        <w:rPr>
+          <w:rFonts w:ascii="Arial" w:cs="Arial" w:eastAsia="Arial" w:hAnsi="Arial"/>
+        </w:rPr>
+        <w:t xml:space="preserve">⚠ Removing the noindex tag alone did not fix indexing. Every game page's auth.js redirected anonymous visitors — including Googlebot, which never has a session — to /signin before any content rendered. Google evaluates the fully rendered page for indexing signals, so it was indexing the redirect target (/signin, correctly noindex'd), not the game page itself. The real fix was the auth architecture change in 4.16, which stopped the forced redirect. This is worth remembering for any future page: a client-side redirect on load for anonymous visitors will silently defeat indexing even with a clean noindex tag, because Google follows the redirect before evaluating robots signals.</w:t>
+      </w:r>
+    </w:p>
+    <w:p>
+      <w:pPr>
+        <w:spacing w:after="120" w:before="0"/>
+      </w:pPr>
+      <w:r>
+        <w:rPr>
+          <w:rFonts w:ascii="Arial" w:cs="Arial" w:eastAsia="Arial" w:hAnsi="Arial"/>
+        </w:rPr>
+        <w:t xml:space="preserve">All five pages were confirmed indexed via Google Search Console URL Inspection (Request Indexing) in August 2026, after both fixes were live. Cache-busting version strings were bumped on every touched HTML file per the usual convention (6.2).</w:t>
+      </w:r>
+    </w:p>
+    <w:p>
       <w:r>
         <w:br w:type="page"/>
       </w:r>
@@ -13662,6 +13942,68 @@
                 <w:szCs w:val="20"/>
               </w:rPr>
               <w:t>Expected behaviour — Confirm email is ON. The member must click the link in their confirmation email first.</w:t>
+            </w:r>
+          </w:p>
+        </w:tc>
+      </w:tr>
+      <w:tr>
+        <w:tc>
+          <w:tcPr>
+            <w:tcW w:type="dxa" w:w="3000"/>
+            <w:tcBorders>
+              <w:top w:val="single" w:color="CCCCCC" w:sz="1"/>
+              <w:left w:val="single" w:color="CCCCCC" w:sz="1"/>
+              <w:bottom w:val="single" w:color="CCCCCC" w:sz="1"/>
+              <w:right w:val="single" w:color="CCCCCC" w:sz="1"/>
+            </w:tcBorders>
+            <w:shd w:fill="F2F2F2" w:val="clear"/>
+            <w:tcMar>
+              <w:top w:type="dxa" w:w="100"/>
+              <w:left w:type="dxa" w:w="150"/>
+              <w:bottom w:type="dxa" w:w="100"/>
+              <w:right w:type="dxa" w:w="150"/>
+            </w:tcMar>
+          </w:tcPr>
+          <w:p>
+            <w:r>
+              <w:rPr>
+                <w:rFonts w:ascii="Arial" w:cs="Arial" w:eastAsia="Arial" w:hAnsi="Arial"/>
+                <w:b/>
+                <w:bCs/>
+                <w:color w:val="0A0E1A"/>
+                <w:sz w:val="20"/>
+                <w:szCs w:val="20"/>
+              </w:rPr>
+              <w:t>noindex removed but Search Console still detects it live</w:t>
+            </w:r>
+          </w:p>
+        </w:tc>
+        <w:tc>
+          <w:tcPr>
+            <w:tcW w:type="dxa" w:w="6360"/>
+            <w:tcBorders>
+              <w:top w:val="single" w:color="CCCCCC" w:sz="1"/>
+              <w:left w:val="single" w:color="CCCCCC" w:sz="1"/>
+              <w:bottom w:val="single" w:color="CCCCCC" w:sz="1"/>
+              <w:right w:val="single" w:color="CCCCCC" w:sz="1"/>
+            </w:tcBorders>
+            <w:shd w:fill="FFFFFF" w:val="clear"/>
+            <w:tcMar>
+              <w:top w:type="dxa" w:w="100"/>
+              <w:left w:type="dxa" w:w="150"/>
+              <w:bottom w:type="dxa" w:w="100"/>
+              <w:right w:type="dxa" w:w="150"/>
+            </w:tcMar>
+          </w:tcPr>
+          <w:p>
+            <w:r>
+              <w:rPr>
+                <w:rFonts w:ascii="Arial" w:cs="Arial" w:eastAsia="Arial" w:hAnsi="Arial"/>
+                <w:color w:val="333333"/>
+                <w:sz w:val="20"/>
+                <w:szCs w:val="20"/>
+              </w:rPr>
+              <w:t>Check for a client-side redirect on that page for anonymous visitors before assuming a cache/deploy issue. Google renders the page before evaluating robots signals, so a JS redirect to a noindex'd page (e.g. /signin) will read as noindex even with a clean static tag. See 4.16 and 5.5 for the August 2026 case where this was the actual root cause on every game page.</w:t>
             </w:r>
           </w:p>
         </w:tc>
@@ -15875,7 +16217,18 @@
           <w:sz w:val="26"/>
           <w:szCs w:val="26"/>
         </w:rPr>
-        <w:t xml:space="preserve">9.2  Near-term</w:t>
+        <w:t xml:space="preserve">9.2  Completed — Standard Tier Made Public &amp; SEO Fix (August 2026)</w:t>
+      </w:r>
+    </w:p>
+    <w:p>
+      <w:pPr>
+        <w:spacing w:after="120" w:before="0"/>
+      </w:pPr>
+      <w:r>
+        <w:rPr>
+          <w:rFonts w:ascii="Arial" w:cs="Arial" w:eastAsia="Arial" w:hAnsi="Arial"/>
+        </w:rPr>
+        <w:t xml:space="preserve">All member portal pages were blocked from Google indexing by a per-page noindex tag plus a forced auth redirect that sent every anonymous visitor — including Googlebot — to /signin before any content rendered. Both issues were fixed and the underlying business model changed at the same time: Standard tier no longer requires an account at all.</w:t>
       </w:r>
     </w:p>
     <w:p>
@@ -15891,7 +16244,7 @@
         <w:rPr>
           <w:rFonts w:ascii="Arial" w:cs="Arial" w:eastAsia="Arial" w:hAnsi="Arial"/>
         </w:rPr>
-        <w:t xml:space="preserve">Register LottoIQ as a Sole Proprietorship in Ontario (~$60 at ServiceOntario)</w:t>
+        <w:t xml:space="preserve">noindex removed from games/lotto-649/, games/lotto-max/, games/lottario/, games/ontario-49/, and proof/; kept on games/custom/, signin/, and reset-password/. See 5.5.</w:t>
       </w:r>
     </w:p>
     <w:p>
@@ -15907,7 +16260,7 @@
         <w:rPr>
           <w:rFonts w:ascii="Arial" w:cs="Arial" w:eastAsia="Arial" w:hAnsi="Arial"/>
         </w:rPr>
-        <w:t xml:space="preserve">Set up Mailchimp — requires a physical address (PO Box or virtual address service)</w:t>
+        <w:t xml:space="preserve">Duplicated meta descriptions fixed — lotto-max, lottario, and ontario-49 had all been shipping the Lotto 6/49 description; each now has its own. See 5.5.</w:t>
       </w:r>
     </w:p>
     <w:p>
@@ -15923,7 +16276,7 @@
         <w:rPr>
           <w:rFonts w:ascii="Arial" w:cs="Arial" w:eastAsia="Arial" w:hAnsi="Arial"/>
         </w:rPr>
-        <w:t xml:space="preserve">Follow up with OLG re: data usage permission for published draw results</w:t>
+        <w:t xml:space="preserve">auth.js reworked so enforceAuth() no longer redirects anonymous visitors — Standard-tier content is public. Only /games/custom/ (Insider-exclusive) still gates on load. See 4.16.</w:t>
       </w:r>
     </w:p>
     <w:p>
@@ -15939,7 +16292,7 @@
         <w:rPr>
           <w:rFonts w:ascii="Arial" w:cs="Arial" w:eastAsia="Arial" w:hAnsi="Arial"/>
         </w:rPr>
-        <w:t xml:space="preserve">Send first monthly Insider report (June 2026 report)</w:t>
+        <w:t xml:space="preserve">Nav updated with a new .nav-signin link for anonymous visitors across the four game pages, proof/, and css/nav.css.</w:t>
       </w:r>
     </w:p>
     <w:p>
@@ -15955,27 +16308,7 @@
         <w:rPr>
           <w:rFonts w:ascii="Arial" w:cs="Arial" w:eastAsia="Arial" w:hAnsi="Arial"/>
         </w:rPr>
-        <w:t xml:space="preserve">Continue Reddit strategy (r/dataisbeautiful active — r/ontario banned; target r/lottery, r/lotto, r/canada next)</w:t>
-      </w:r>
-    </w:p>
-    <w:p>
-      <w:pPr>
-        <w:pStyle w:val="Heading2"/>
-        <w:pBdr>
-          <w:bottom w:val="single" w:color="D4AF37" w:sz="3"/>
-        </w:pBdr>
-        <w:spacing w:after="120" w:before="300"/>
-      </w:pPr>
-      <w:r>
-        <w:rPr>
-          <w:rFonts w:ascii="Arial" w:cs="Arial" w:eastAsia="Arial" w:hAnsi="Arial"/>
-          <w:b/>
-          <w:bCs/>
-          <w:color w:val="0A0E1A"/>
-          <w:sz w:val="26"/>
-          <w:szCs w:val="26"/>
-        </w:rPr>
-        <w:t xml:space="preserve">9.3  Future Features</w:t>
+        <w:t xml:space="preserve">Wix homepage CTA changed from "Sign Up Free" to "View Live Numbers →", linking directly to stats.lottoiq.ca/games/lotto-649/; pricing card copy updated to mark Standard "Free — no account required".</w:t>
       </w:r>
     </w:p>
     <w:p>
@@ -15991,7 +16324,27 @@
         <w:rPr>
           <w:rFonts w:ascii="Arial" w:cs="Arial" w:eastAsia="Arial" w:hAnsi="Arial"/>
         </w:rPr>
-        <w:t xml:space="preserve">Deploy Flask API to Railway — unlocks the full Python analytics engine</w:t>
+        <w:t xml:space="preserve">All five pages confirmed indexed via Search Console URL Inspection / Request Indexing, August 2026.</w:t>
+      </w:r>
+    </w:p>
+    <w:p>
+      <w:pPr>
+        <w:pStyle w:val="Heading2"/>
+        <w:pBdr>
+          <w:bottom w:val="single" w:color="D4AF37" w:sz="3"/>
+        </w:pBdr>
+        <w:spacing w:after="120" w:before="300"/>
+      </w:pPr>
+      <w:r>
+        <w:rPr>
+          <w:rFonts w:ascii="Arial" w:cs="Arial" w:eastAsia="Arial" w:hAnsi="Arial"/>
+          <w:b/>
+          <w:bCs/>
+          <w:color w:val="0A0E1A"/>
+          <w:sz w:val="26"/>
+          <w:szCs w:val="26"/>
+        </w:rPr>
+        <w:t xml:space="preserve">9.3  Near-term</w:t>
       </w:r>
     </w:p>
     <w:p>
@@ -16007,7 +16360,7 @@
         <w:rPr>
           <w:rFonts w:ascii="Arial" w:cs="Arial" w:eastAsia="Arial" w:hAnsi="Arial"/>
         </w:rPr>
-        <w:t xml:space="preserve">Save Pick feature — requires a new Netlify Function with Google Sheets write access</w:t>
+        <w:t xml:space="preserve">Register LottoIQ as a Sole Proprietorship in Ontario (~$60 at ServiceOntario)</w:t>
       </w:r>
     </w:p>
     <w:p>
@@ -16023,7 +16376,7 @@
         <w:rPr>
           <w:rFonts w:ascii="Arial" w:cs="Arial" w:eastAsia="Arial" w:hAnsi="Arial"/>
         </w:rPr>
-        <w:t xml:space="preserve">Jackpot data — jackpot column exists in Google Sheets but is not yet populated</w:t>
+        <w:t xml:space="preserve">Set up Mailchimp — requires a physical address (PO Box or virtual address service)</w:t>
       </w:r>
     </w:p>
     <w:p>
@@ -16039,7 +16392,7 @@
         <w:rPr>
           <w:rFonts w:ascii="Arial" w:cs="Arial" w:eastAsia="Arial" w:hAnsi="Arial"/>
         </w:rPr>
-        <w:t xml:space="preserve">Individual game pages on the Wix public site</w:t>
+        <w:t xml:space="preserve">Follow up with OLG re: data usage permission for published draw results</w:t>
       </w:r>
     </w:p>
     <w:p>
@@ -16055,7 +16408,7 @@
         <w:rPr>
           <w:rFonts w:ascii="Arial" w:cs="Arial" w:eastAsia="Arial" w:hAnsi="Arial"/>
         </w:rPr>
-        <w:t xml:space="preserve">Blog setup on Wix</w:t>
+        <w:t xml:space="preserve">Send first monthly Insider report (June 2026 report)</w:t>
       </w:r>
     </w:p>
     <w:p>
@@ -16071,7 +16424,7 @@
         <w:rPr>
           <w:rFonts w:ascii="Arial" w:cs="Arial" w:eastAsia="Arial" w:hAnsi="Arial"/>
         </w:rPr>
-        <w:t xml:space="preserve">Generator Honesty Scoreboard (Feature 3, Part B) — scoring job + public UI. Blocked on the generated_log window (started July 2026) running 6–8 weeks before there’s enough data to reconcile against real draws.</w:t>
+        <w:t xml:space="preserve">Continue Reddit strategy (r/dataisbeautiful active — r/ontario banned; target r/lottery, r/lotto, r/canada next)</w:t>
       </w:r>
     </w:p>
     <w:p>
@@ -16091,7 +16444,123 @@
           <w:sz w:val="26"/>
           <w:szCs w:val="26"/>
         </w:rPr>
-        <w:t xml:space="preserve">9.4  Current State Summary</w:t>
+        <w:t xml:space="preserve">9.4  Future Features</w:t>
+      </w:r>
+    </w:p>
+    <w:p>
+      <w:pPr>
+        <w:pStyle w:val="ListParagraph"/>
+        <w:numPr>
+          <w:ilvl w:val="0"/>
+          <w:numId w:val="2"/>
+        </w:numPr>
+        <w:spacing w:after="60" w:before="0"/>
+      </w:pPr>
+      <w:r>
+        <w:rPr>
+          <w:rFonts w:ascii="Arial" w:cs="Arial" w:eastAsia="Arial" w:hAnsi="Arial"/>
+        </w:rPr>
+        <w:t xml:space="preserve">Deploy Flask API to Railway — unlocks the full Python analytics engine</w:t>
+      </w:r>
+    </w:p>
+    <w:p>
+      <w:pPr>
+        <w:pStyle w:val="ListParagraph"/>
+        <w:numPr>
+          <w:ilvl w:val="0"/>
+          <w:numId w:val="2"/>
+        </w:numPr>
+        <w:spacing w:after="60" w:before="0"/>
+      </w:pPr>
+      <w:r>
+        <w:rPr>
+          <w:rFonts w:ascii="Arial" w:cs="Arial" w:eastAsia="Arial" w:hAnsi="Arial"/>
+        </w:rPr>
+        <w:t xml:space="preserve">Save Pick feature — requires a new Netlify Function with Google Sheets write access</w:t>
+      </w:r>
+    </w:p>
+    <w:p>
+      <w:pPr>
+        <w:pStyle w:val="ListParagraph"/>
+        <w:numPr>
+          <w:ilvl w:val="0"/>
+          <w:numId w:val="2"/>
+        </w:numPr>
+        <w:spacing w:after="60" w:before="0"/>
+      </w:pPr>
+      <w:r>
+        <w:rPr>
+          <w:rFonts w:ascii="Arial" w:cs="Arial" w:eastAsia="Arial" w:hAnsi="Arial"/>
+        </w:rPr>
+        <w:t xml:space="preserve">Jackpot data — jackpot column exists in Google Sheets but is not yet populated</w:t>
+      </w:r>
+    </w:p>
+    <w:p>
+      <w:pPr>
+        <w:pStyle w:val="ListParagraph"/>
+        <w:numPr>
+          <w:ilvl w:val="0"/>
+          <w:numId w:val="2"/>
+        </w:numPr>
+        <w:spacing w:after="60" w:before="0"/>
+      </w:pPr>
+      <w:r>
+        <w:rPr>
+          <w:rFonts w:ascii="Arial" w:cs="Arial" w:eastAsia="Arial" w:hAnsi="Arial"/>
+        </w:rPr>
+        <w:t xml:space="preserve">Individual game pages on the Wix public site</w:t>
+      </w:r>
+    </w:p>
+    <w:p>
+      <w:pPr>
+        <w:pStyle w:val="ListParagraph"/>
+        <w:numPr>
+          <w:ilvl w:val="0"/>
+          <w:numId w:val="2"/>
+        </w:numPr>
+        <w:spacing w:after="60" w:before="0"/>
+      </w:pPr>
+      <w:r>
+        <w:rPr>
+          <w:rFonts w:ascii="Arial" w:cs="Arial" w:eastAsia="Arial" w:hAnsi="Arial"/>
+        </w:rPr>
+        <w:t xml:space="preserve">Blog setup on Wix</w:t>
+      </w:r>
+    </w:p>
+    <w:p>
+      <w:pPr>
+        <w:pStyle w:val="ListParagraph"/>
+        <w:numPr>
+          <w:ilvl w:val="0"/>
+          <w:numId w:val="2"/>
+        </w:numPr>
+        <w:spacing w:after="60" w:before="0"/>
+      </w:pPr>
+      <w:r>
+        <w:rPr>
+          <w:rFonts w:ascii="Arial" w:cs="Arial" w:eastAsia="Arial" w:hAnsi="Arial"/>
+        </w:rPr>
+        <w:t xml:space="preserve">Generator Honesty Scoreboard (Feature 3, Part B) — scoring job + public UI. Blocked on the generated_log window (started July 2026) running 6–8 weeks before there’s enough data to reconcile against real draws.</w:t>
+      </w:r>
+    </w:p>
+    <w:p>
+      <w:pPr>
+        <w:pStyle w:val="Heading2"/>
+        <w:pBdr>
+          <w:bottom w:val="single" w:color="D4AF37" w:sz="3"/>
+        </w:pBdr>
+        <w:spacing w:after="120" w:before="300"/>
+      </w:pPr>
+      <w:r>
+        <w:rPr>
+          <w:rFonts w:ascii="Arial" w:cs="Arial" w:eastAsia="Arial" w:hAnsi="Arial"/>
+          <w:b/>
+          <w:bCs/>
+          <w:color w:val="0A0E1A"/>
+          <w:sz w:val="26"/>
+          <w:szCs w:val="26"/>
+        </w:rPr>
+        <w:t xml:space="preserve">9.5  Current State Summary</w:t>
       </w:r>
     </w:p>
     <w:tbl>
@@ -17176,6 +17645,72 @@
           <w:p>
             <w:r>
               <w:t>BUILT &amp; VERIFIED — July 2026. Every Generator set (Standard single-set and Insider multi-set) logs anonymously to the generated_log Sheet tab via a new service-account-authenticated Netlify Function. Fire-and-forget — verified the Generator UI degrades silently if logging fails. Starts the 6–8 week data window Feature 3 Part B (Generator Honesty Scoreboard) needs before it can be built. See 2.6, 2.7.</w:t>
+            </w:r>
+          </w:p>
+        </w:tc>
+      </w:tr>
+      <w:tr>
+        <w:tc>
+          <w:tcPr>
+            <w:tcW w:type="dxa" w:w="3000"/>
+          </w:tcPr>
+          <w:p>
+            <w:r>
+              <w:t>Standard tier public access (no sign-up)</w:t>
+            </w:r>
+          </w:p>
+        </w:tc>
+        <w:tc>
+          <w:tcPr>
+            <w:tcW w:type="dxa" w:w="6360"/>
+          </w:tcPr>
+          <w:p>
+            <w:r>
+              <w:t>DONE — August 2026. auth.js no longer redirects anonymous visitors on game pages; Standard content is fully public. Only Insider and /games/custom/ require an account. See 4.16, 9.2.</w:t>
+            </w:r>
+          </w:p>
+        </w:tc>
+      </w:tr>
+      <w:tr>
+        <w:tc>
+          <w:tcPr>
+            <w:tcW w:type="dxa" w:w="3000"/>
+          </w:tcPr>
+          <w:p>
+            <w:r>
+              <w:t>noindex removal &amp; meta description fix</w:t>
+            </w:r>
+          </w:p>
+        </w:tc>
+        <w:tc>
+          <w:tcPr>
+            <w:tcW w:type="dxa" w:w="6360"/>
+          </w:tcPr>
+          <w:p>
+            <w:r>
+              <w:t>DONE — August 2026. noindex removed from the 4 game pages + proof/; per-game meta descriptions corrected (lotto-max/lottario/ontario-49 had all shipped the Lotto 6/49 description). See 5.5, 9.2.</w:t>
+            </w:r>
+          </w:p>
+        </w:tc>
+      </w:tr>
+      <w:tr>
+        <w:tc>
+          <w:tcPr>
+            <w:tcW w:type="dxa" w:w="3000"/>
+          </w:tcPr>
+          <w:p>
+            <w:r>
+              <w:t>Google indexing</w:t>
+            </w:r>
+          </w:p>
+        </w:tc>
+        <w:tc>
+          <w:tcPr>
+            <w:tcW w:type="dxa" w:w="6360"/>
+          </w:tcPr>
+          <w:p>
+            <w:r>
+              <w:t>DONE — August 2026. All 5 public pages confirmed indexed via Search Console URL Inspection after the noindex and auth-redirect fixes shipped.</w:t>
             </w:r>
           </w:p>
         </w:tc>

</xml_diff>